<commit_message>
updated resume and summary documents
</commit_message>
<xml_diff>
--- a/SumitKalra_AgenticAIEngineer_Resume.docx
+++ b/SumitKalra_AgenticAIEngineer_Resume.docx
@@ -63,19 +63,13 @@
               <w:spacing w:after="160"/>
               <w:rPr>
                 <w:rFonts w:asciiTheme="majorHAnsi" w:hAnsiTheme="majorHAnsi" w:cstheme="majorHAnsi"/>
-              </w:rPr>
-            </w:pPr>
-            <w:r>
-              <w:rPr>
-                <w:rFonts w:asciiTheme="majorHAnsi" w:hAnsiTheme="majorHAnsi" w:cstheme="majorHAnsi"/>
                 <w:b/>
                 <w:bCs/>
                 <w:color w:val="2B6CB0"/>
                 <w:sz w:val="22"/>
                 <w:szCs w:val="22"/>
               </w:rPr>
-              <w:t>Senior Agentic AI Engineer</w:t>
-            </w:r>
+            </w:pPr>
             <w:r>
               <w:rPr>
                 <w:rFonts w:asciiTheme="majorHAnsi" w:hAnsiTheme="majorHAnsi" w:cstheme="majorHAnsi"/>
@@ -85,8 +79,109 @@
                 <w:sz w:val="22"/>
                 <w:szCs w:val="22"/>
               </w:rPr>
-              <w:t xml:space="preserve"> | Low Code Tech Architect</w:t>
-            </w:r>
+              <w:t>Senior Agentic AI Engineer</w:t>
+            </w:r>
+            <w:r>
+              <w:rPr>
+                <w:rFonts w:asciiTheme="majorHAnsi" w:hAnsiTheme="majorHAnsi" w:cstheme="majorHAnsi"/>
+                <w:b/>
+                <w:bCs/>
+                <w:color w:val="2B6CB0"/>
+                <w:sz w:val="22"/>
+                <w:szCs w:val="22"/>
+              </w:rPr>
+              <w:t xml:space="preserve"> | Low Code </w:t>
+            </w:r>
+            <w:r>
+              <w:rPr>
+                <w:rFonts w:asciiTheme="majorHAnsi" w:hAnsiTheme="majorHAnsi" w:cstheme="majorHAnsi"/>
+                <w:b/>
+                <w:bCs/>
+                <w:color w:val="2B6CB0"/>
+                <w:sz w:val="22"/>
+                <w:szCs w:val="22"/>
+              </w:rPr>
+              <w:t xml:space="preserve">Platform </w:t>
+            </w:r>
+            <w:r>
+              <w:rPr>
+                <w:rFonts w:asciiTheme="majorHAnsi" w:hAnsiTheme="majorHAnsi" w:cstheme="majorHAnsi"/>
+                <w:b/>
+                <w:bCs/>
+                <w:color w:val="2B6CB0"/>
+                <w:sz w:val="22"/>
+                <w:szCs w:val="22"/>
+              </w:rPr>
+              <w:t>Tech Architect</w:t>
+            </w:r>
+          </w:p>
+          <w:p>
+            <w:pPr>
+              <w:spacing w:after="160"/>
+              <w:rPr>
+                <w:rFonts w:asciiTheme="majorHAnsi" w:hAnsiTheme="majorHAnsi" w:cstheme="majorHAnsi"/>
+                <w:sz w:val="16"/>
+                <w:szCs w:val="16"/>
+              </w:rPr>
+            </w:pPr>
+            <w:r>
+              <w:rPr>
+                <w:rFonts w:asciiTheme="majorHAnsi" w:hAnsiTheme="majorHAnsi" w:cstheme="majorHAnsi"/>
+                <w:color w:val="2B6CB0"/>
+                <w:sz w:val="16"/>
+                <w:szCs w:val="16"/>
+              </w:rPr>
+              <w:t>Chat with m</w:t>
+            </w:r>
+            <w:r>
+              <w:rPr>
+                <w:rFonts w:asciiTheme="majorHAnsi" w:hAnsiTheme="majorHAnsi" w:cstheme="majorHAnsi"/>
+                <w:color w:val="2B6CB0"/>
+                <w:sz w:val="16"/>
+                <w:szCs w:val="16"/>
+              </w:rPr>
+              <w:t xml:space="preserve">y </w:t>
+            </w:r>
+            <w:r>
+              <w:rPr>
+                <w:rFonts w:asciiTheme="majorHAnsi" w:hAnsiTheme="majorHAnsi" w:cstheme="majorHAnsi"/>
+                <w:b/>
+                <w:bCs/>
+                <w:color w:val="2B6CB0"/>
+                <w:sz w:val="16"/>
+                <w:szCs w:val="16"/>
+              </w:rPr>
+              <w:t xml:space="preserve">AI-Powered </w:t>
+            </w:r>
+            <w:r>
+              <w:rPr>
+                <w:rFonts w:asciiTheme="majorHAnsi" w:hAnsiTheme="majorHAnsi" w:cstheme="majorHAnsi"/>
+                <w:color w:val="2B6CB0"/>
+                <w:sz w:val="16"/>
+                <w:szCs w:val="16"/>
+              </w:rPr>
+              <w:t>career assistant</w:t>
+            </w:r>
+            <w:r>
+              <w:rPr>
+                <w:rFonts w:asciiTheme="majorHAnsi" w:hAnsiTheme="majorHAnsi" w:cstheme="majorHAnsi"/>
+                <w:color w:val="2B6CB0"/>
+                <w:sz w:val="16"/>
+                <w:szCs w:val="16"/>
+              </w:rPr>
+              <w:t xml:space="preserve">: </w:t>
+            </w:r>
+            <w:hyperlink r:id="rId7" w:history="1">
+              <w:r>
+                <w:rPr>
+                  <w:rStyle w:val="Hyperlink"/>
+                  <w:rFonts w:asciiTheme="majorHAnsi" w:hAnsiTheme="majorHAnsi" w:cstheme="majorHAnsi"/>
+                  <w:sz w:val="16"/>
+                  <w:szCs w:val="16"/>
+                </w:rPr>
+                <w:t>https://sumit-ai-career-agent.onrender.com/</w:t>
+              </w:r>
+            </w:hyperlink>
           </w:p>
           <w:p>
             <w:pPr>
@@ -125,7 +220,31 @@
                 <w:sz w:val="18"/>
                 <w:szCs w:val="18"/>
               </w:rPr>
-              <w:t xml:space="preserve">Senior Agentic AI Engineer with 3 years of Python development experience, specializing in building autonomous, multi-step AI agents using the </w:t>
+              <w:t xml:space="preserve">Senior Agentic AI Engineer with </w:t>
+            </w:r>
+            <w:r>
+              <w:rPr>
+                <w:rFonts w:asciiTheme="majorHAnsi" w:hAnsiTheme="majorHAnsi" w:cstheme="majorHAnsi"/>
+                <w:sz w:val="18"/>
+                <w:szCs w:val="18"/>
+              </w:rPr>
+              <w:t>3</w:t>
+            </w:r>
+            <w:r>
+              <w:rPr>
+                <w:rFonts w:asciiTheme="majorHAnsi" w:hAnsiTheme="majorHAnsi" w:cstheme="majorHAnsi"/>
+                <w:sz w:val="18"/>
+                <w:szCs w:val="18"/>
+              </w:rPr>
+              <w:t>+</w:t>
+            </w:r>
+            <w:r>
+              <w:rPr>
+                <w:rFonts w:asciiTheme="majorHAnsi" w:hAnsiTheme="majorHAnsi" w:cstheme="majorHAnsi"/>
+                <w:sz w:val="18"/>
+                <w:szCs w:val="18"/>
+              </w:rPr>
+              <w:t xml:space="preserve"> years of Python development experience, specializing in building autonomous, multi-step AI agents using the </w:t>
             </w:r>
             <w:r>
               <w:rPr>
@@ -223,18 +342,38 @@
               <w:spacing w:after="100"/>
               <w:rPr>
                 <w:rFonts w:asciiTheme="majorHAnsi" w:hAnsiTheme="majorHAnsi" w:cstheme="majorHAnsi"/>
-                <w:sz w:val="18"/>
-                <w:szCs w:val="18"/>
-              </w:rPr>
-            </w:pPr>
-            <w:r>
-              <w:rPr>
-                <w:rFonts w:asciiTheme="majorHAnsi" w:hAnsiTheme="majorHAnsi" w:cstheme="majorHAnsi"/>
                 <w:color w:val="333333"/>
                 <w:sz w:val="18"/>
                 <w:szCs w:val="18"/>
               </w:rPr>
-              <w:t xml:space="preserve">Low Code BPM Architect (CLSA) with a strong background in enterprise architecture across GovTech, banking, and insurance domains. Currently pursuing an Executive Diploma in </w:t>
+            </w:pPr>
+            <w:r>
+              <w:rPr>
+                <w:rFonts w:asciiTheme="majorHAnsi" w:hAnsiTheme="majorHAnsi" w:cstheme="majorHAnsi"/>
+                <w:color w:val="333333"/>
+                <w:sz w:val="18"/>
+                <w:szCs w:val="18"/>
+              </w:rPr>
+              <w:t xml:space="preserve">Low Code BPM Architect (CLSA) with a strong background in enterprise architecture across GovTech, banking, and insurance domains. </w:t>
+            </w:r>
+          </w:p>
+          <w:p>
+            <w:pPr>
+              <w:spacing w:after="100"/>
+              <w:rPr>
+                <w:rFonts w:asciiTheme="majorHAnsi" w:hAnsiTheme="majorHAnsi" w:cstheme="majorHAnsi"/>
+                <w:sz w:val="18"/>
+                <w:szCs w:val="18"/>
+              </w:rPr>
+            </w:pPr>
+            <w:r>
+              <w:rPr>
+                <w:rFonts w:asciiTheme="majorHAnsi" w:hAnsiTheme="majorHAnsi" w:cstheme="majorHAnsi"/>
+                <w:color w:val="333333"/>
+                <w:sz w:val="18"/>
+                <w:szCs w:val="18"/>
+              </w:rPr>
+              <w:t xml:space="preserve">Currently pursuing an Executive Diploma in </w:t>
             </w:r>
             <w:r>
               <w:rPr>
@@ -308,7 +447,73 @@
                 <w:sz w:val="21"/>
                 <w:szCs w:val="21"/>
               </w:rPr>
-              <w:t>Solutions Architect — Agentic AI Coding Agent</w:t>
+              <w:t xml:space="preserve">Solutions Architect — </w:t>
+            </w:r>
+            <w:r>
+              <w:rPr>
+                <w:rFonts w:asciiTheme="majorHAnsi" w:hAnsiTheme="majorHAnsi" w:cstheme="majorHAnsi"/>
+                <w:b/>
+                <w:bCs/>
+                <w:color w:val="1B1B1B"/>
+                <w:sz w:val="21"/>
+                <w:szCs w:val="21"/>
+              </w:rPr>
+              <w:t>S</w:t>
+            </w:r>
+            <w:r>
+              <w:rPr>
+                <w:rFonts w:asciiTheme="majorHAnsi" w:hAnsiTheme="majorHAnsi" w:cstheme="majorHAnsi"/>
+                <w:b/>
+                <w:bCs/>
+                <w:color w:val="1B1B1B"/>
+                <w:sz w:val="21"/>
+                <w:szCs w:val="21"/>
+              </w:rPr>
+              <w:t>r</w:t>
+            </w:r>
+            <w:r>
+              <w:rPr>
+                <w:rFonts w:asciiTheme="majorHAnsi" w:hAnsiTheme="majorHAnsi" w:cstheme="majorHAnsi"/>
+                <w:b/>
+                <w:bCs/>
+                <w:color w:val="1B1B1B"/>
+                <w:sz w:val="21"/>
+                <w:szCs w:val="21"/>
+              </w:rPr>
+              <w:t>.</w:t>
+            </w:r>
+            <w:r>
+              <w:rPr>
+                <w:rFonts w:asciiTheme="majorHAnsi" w:hAnsiTheme="majorHAnsi" w:cstheme="majorHAnsi"/>
+                <w:b/>
+                <w:bCs/>
+                <w:color w:val="1B1B1B"/>
+                <w:sz w:val="21"/>
+                <w:szCs w:val="21"/>
+              </w:rPr>
+              <w:t xml:space="preserve"> </w:t>
+            </w:r>
+            <w:r>
+              <w:rPr>
+                <w:rFonts w:asciiTheme="majorHAnsi" w:hAnsiTheme="majorHAnsi" w:cstheme="majorHAnsi"/>
+                <w:b/>
+                <w:bCs/>
+                <w:color w:val="1B1B1B"/>
+                <w:sz w:val="21"/>
+                <w:szCs w:val="21"/>
+              </w:rPr>
+              <w:t xml:space="preserve">Agentic AI </w:t>
+            </w:r>
+            <w:r>
+              <w:rPr>
+                <w:rFonts w:asciiTheme="majorHAnsi" w:hAnsiTheme="majorHAnsi" w:cstheme="majorHAnsi"/>
+                <w:b/>
+                <w:bCs/>
+                <w:color w:val="1B1B1B"/>
+                <w:sz w:val="21"/>
+                <w:szCs w:val="21"/>
+              </w:rPr>
+              <w:t>Engineer</w:t>
             </w:r>
             <w:r>
               <w:rPr>
@@ -320,7 +525,83 @@
                 <w:szCs w:val="18"/>
               </w:rPr>
               <w:tab/>
-              <w:t>2025 – 2026</w:t>
+            </w:r>
+            <w:r>
+              <w:rPr>
+                <w:rFonts w:asciiTheme="majorHAnsi" w:hAnsiTheme="majorHAnsi" w:cstheme="majorHAnsi"/>
+                <w:i/>
+                <w:iCs/>
+                <w:color w:val="555555"/>
+                <w:sz w:val="18"/>
+                <w:szCs w:val="18"/>
+              </w:rPr>
+              <w:t xml:space="preserve">Aug </w:t>
+            </w:r>
+            <w:r>
+              <w:rPr>
+                <w:rFonts w:asciiTheme="majorHAnsi" w:hAnsiTheme="majorHAnsi" w:cstheme="majorHAnsi"/>
+                <w:i/>
+                <w:iCs/>
+                <w:color w:val="555555"/>
+                <w:sz w:val="18"/>
+                <w:szCs w:val="18"/>
+              </w:rPr>
+              <w:t>202</w:t>
+            </w:r>
+            <w:r>
+              <w:rPr>
+                <w:rFonts w:asciiTheme="majorHAnsi" w:hAnsiTheme="majorHAnsi" w:cstheme="majorHAnsi"/>
+                <w:i/>
+                <w:iCs/>
+                <w:color w:val="555555"/>
+                <w:sz w:val="18"/>
+                <w:szCs w:val="18"/>
+              </w:rPr>
+              <w:t>4</w:t>
+            </w:r>
+            <w:r>
+              <w:rPr>
+                <w:rFonts w:asciiTheme="majorHAnsi" w:hAnsiTheme="majorHAnsi" w:cstheme="majorHAnsi"/>
+                <w:i/>
+                <w:iCs/>
+                <w:color w:val="555555"/>
+                <w:sz w:val="18"/>
+                <w:szCs w:val="18"/>
+              </w:rPr>
+              <w:t xml:space="preserve"> – </w:t>
+            </w:r>
+            <w:r>
+              <w:rPr>
+                <w:rFonts w:asciiTheme="majorHAnsi" w:hAnsiTheme="majorHAnsi" w:cstheme="majorHAnsi"/>
+                <w:i/>
+                <w:iCs/>
+                <w:color w:val="555555"/>
+                <w:sz w:val="18"/>
+                <w:szCs w:val="18"/>
+              </w:rPr>
+              <w:t xml:space="preserve">Feb </w:t>
+            </w:r>
+            <w:r>
+              <w:rPr>
+                <w:rFonts w:asciiTheme="majorHAnsi" w:hAnsiTheme="majorHAnsi" w:cstheme="majorHAnsi"/>
+                <w:i/>
+                <w:iCs/>
+                <w:color w:val="555555"/>
+                <w:sz w:val="18"/>
+                <w:szCs w:val="18"/>
+              </w:rPr>
+              <w:t>20</w:t>
+            </w:r>
+            <w:r>
+              <w:rPr>
+                <w:rFonts w:asciiTheme="majorHAnsi" w:hAnsiTheme="majorHAnsi" w:cstheme="majorHAnsi"/>
+                <w:i/>
+                <w:iCs/>
+                <w:color w:val="555555"/>
+                <w:sz w:val="18"/>
+                <w:szCs w:val="18"/>
+              </w:rPr>
+              <w:t>26</w:t>
             </w:r>
           </w:p>
           <w:p>
@@ -342,7 +623,7 @@
                 <w:sz w:val="19"/>
                 <w:szCs w:val="19"/>
               </w:rPr>
-              <w:t>Accenture Pte Ltd — GovTech (IRIS Platform)</w:t>
+              <w:t>Accenture Pte Ltd — GovTech</w:t>
             </w:r>
             <w:r>
               <w:rPr>
@@ -396,11 +677,36 @@
             <w:r>
               <w:rPr>
                 <w:rFonts w:asciiTheme="majorHAnsi" w:hAnsiTheme="majorHAnsi" w:cstheme="majorHAnsi"/>
-                <w:color w:val="333333"/>
-                <w:sz w:val="18"/>
-                <w:szCs w:val="18"/>
-              </w:rPr>
-              <w:t>Engineered the agent to autonomously author test cases in support of system testing, improving test coverage and reducing manual QA turnaround.</w:t>
+                <w:sz w:val="18"/>
+                <w:szCs w:val="18"/>
+              </w:rPr>
+              <w:t>It helped</w:t>
+            </w:r>
+            <w:r>
+              <w:rPr>
+                <w:rFonts w:asciiTheme="majorHAnsi" w:hAnsiTheme="majorHAnsi" w:cstheme="majorHAnsi"/>
+                <w:sz w:val="18"/>
+                <w:szCs w:val="18"/>
+              </w:rPr>
+              <w:t xml:space="preserve"> automate code generation, testing, and documentation, reducing feature development time by </w:t>
+            </w:r>
+            <w:r>
+              <w:rPr>
+                <w:rFonts w:asciiTheme="majorHAnsi" w:hAnsiTheme="majorHAnsi" w:cstheme="majorHAnsi"/>
+                <w:b/>
+                <w:bCs/>
+                <w:sz w:val="18"/>
+                <w:szCs w:val="18"/>
+              </w:rPr>
+              <w:t>35–45%</w:t>
+            </w:r>
+            <w:r>
+              <w:rPr>
+                <w:rFonts w:asciiTheme="majorHAnsi" w:hAnsiTheme="majorHAnsi" w:cstheme="majorHAnsi"/>
+                <w:sz w:val="18"/>
+                <w:szCs w:val="18"/>
+              </w:rPr>
+              <w:t>.</w:t>
             </w:r>
           </w:p>
           <w:p>
@@ -420,20 +726,28 @@
             <w:r>
               <w:rPr>
                 <w:rFonts w:asciiTheme="majorHAnsi" w:hAnsiTheme="majorHAnsi" w:cstheme="majorHAnsi"/>
-                <w:color w:val="333333"/>
-                <w:sz w:val="18"/>
-                <w:szCs w:val="18"/>
-              </w:rPr>
-              <w:t>Integrated the agent into the IRIS delivery workflow to accelerate module development for the GovTech case-management platform</w:t>
-            </w:r>
-            <w:r>
-              <w:rPr>
-                <w:rFonts w:asciiTheme="majorHAnsi" w:hAnsiTheme="majorHAnsi" w:cstheme="majorHAnsi"/>
-                <w:color w:val="333333"/>
-                <w:sz w:val="18"/>
-                <w:szCs w:val="18"/>
-              </w:rPr>
-              <w:t xml:space="preserve"> reducing development time by upto 40%.</w:t>
+                <w:sz w:val="18"/>
+                <w:szCs w:val="18"/>
+              </w:rPr>
+              <w:t xml:space="preserve">Improved first-pass build success to </w:t>
+            </w:r>
+            <w:r>
+              <w:rPr>
+                <w:rFonts w:asciiTheme="majorHAnsi" w:hAnsiTheme="majorHAnsi" w:cstheme="majorHAnsi"/>
+                <w:b/>
+                <w:bCs/>
+                <w:sz w:val="18"/>
+                <w:szCs w:val="18"/>
+              </w:rPr>
+              <w:t>90%</w:t>
+            </w:r>
+            <w:r>
+              <w:rPr>
+                <w:rFonts w:asciiTheme="majorHAnsi" w:hAnsiTheme="majorHAnsi" w:cstheme="majorHAnsi"/>
+                <w:sz w:val="18"/>
+                <w:szCs w:val="18"/>
+              </w:rPr>
+              <w:t xml:space="preserve">, decreasing developer rework during feature implementation. </w:t>
             </w:r>
           </w:p>
           <w:p>
@@ -453,11 +767,28 @@
             <w:r>
               <w:rPr>
                 <w:rFonts w:asciiTheme="majorHAnsi" w:hAnsiTheme="majorHAnsi" w:cstheme="majorHAnsi"/>
-                <w:color w:val="333333"/>
-                <w:sz w:val="18"/>
-                <w:szCs w:val="18"/>
-              </w:rPr>
-              <w:t>Partnered with architecture and QA teams to validate agent-generated code against enterprise coding standards and platform guardrails.</w:t>
+                <w:sz w:val="18"/>
+                <w:szCs w:val="18"/>
+              </w:rPr>
+              <w:t xml:space="preserve">Automated generation of </w:t>
+            </w:r>
+            <w:r>
+              <w:rPr>
+                <w:rFonts w:asciiTheme="majorHAnsi" w:hAnsiTheme="majorHAnsi" w:cstheme="majorHAnsi"/>
+                <w:b/>
+                <w:bCs/>
+                <w:sz w:val="18"/>
+                <w:szCs w:val="18"/>
+              </w:rPr>
+              <w:t>70%</w:t>
+            </w:r>
+            <w:r>
+              <w:rPr>
+                <w:rFonts w:asciiTheme="majorHAnsi" w:hAnsiTheme="majorHAnsi" w:cstheme="majorHAnsi"/>
+                <w:sz w:val="18"/>
+                <w:szCs w:val="18"/>
+              </w:rPr>
+              <w:t xml:space="preserve"> of boilerplate backend code, allowing engineers to focus on business logic.</w:t>
             </w:r>
           </w:p>
           <w:p>
@@ -481,7 +812,7 @@
                 <w:sz w:val="18"/>
                 <w:szCs w:val="18"/>
               </w:rPr>
-              <w:t>Designed technical solutions from requirements, factoring in security, maintainability, and extensibility; resolved business-critical issues swiftly.</w:t>
+              <w:t>Engineered the agent to autonomously author test cases in support of system testing, improving test coverage and reducing manual QA turnaround.</w:t>
             </w:r>
           </w:p>
           <w:p>
@@ -505,80 +836,7 @@
                 <w:sz w:val="18"/>
                 <w:szCs w:val="18"/>
               </w:rPr>
-              <w:t>Ensured teams followed SDLC practices and adhered to architecture and platform guardrails and best practices.</w:t>
-            </w:r>
-          </w:p>
-          <w:p>
-            <w:pPr>
-              <w:spacing w:after="120"/>
-              <w:rPr>
-                <w:rFonts w:asciiTheme="majorHAnsi" w:hAnsiTheme="majorHAnsi" w:cstheme="majorHAnsi"/>
-              </w:rPr>
-            </w:pPr>
-          </w:p>
-          <w:p>
-            <w:pPr>
-              <w:tabs>
-                <w:tab w:val="right" w:pos="5760"/>
-              </w:tabs>
-              <w:rPr>
-                <w:rFonts w:asciiTheme="majorHAnsi" w:hAnsiTheme="majorHAnsi" w:cstheme="majorHAnsi"/>
-              </w:rPr>
-            </w:pPr>
-            <w:r>
-              <w:rPr>
-                <w:rFonts w:asciiTheme="majorHAnsi" w:hAnsiTheme="majorHAnsi" w:cstheme="majorHAnsi"/>
-                <w:b/>
-                <w:bCs/>
-                <w:color w:val="1B1B1B"/>
-                <w:sz w:val="21"/>
-                <w:szCs w:val="21"/>
-              </w:rPr>
-              <w:t>Lead Consultant</w:t>
-            </w:r>
-            <w:r>
-              <w:rPr>
-                <w:rFonts w:asciiTheme="majorHAnsi" w:hAnsiTheme="majorHAnsi" w:cstheme="majorHAnsi"/>
-                <w:i/>
-                <w:iCs/>
-                <w:color w:val="555555"/>
-                <w:sz w:val="18"/>
-                <w:szCs w:val="18"/>
-              </w:rPr>
-              <w:tab/>
-              <w:t>Jun 2023 – Aug 2024</w:t>
-            </w:r>
-          </w:p>
-          <w:p>
-            <w:pPr>
-              <w:tabs>
-                <w:tab w:val="right" w:pos="5760"/>
-              </w:tabs>
-              <w:spacing w:after="60"/>
-              <w:rPr>
-                <w:rFonts w:asciiTheme="majorHAnsi" w:hAnsiTheme="majorHAnsi" w:cstheme="majorHAnsi"/>
-              </w:rPr>
-            </w:pPr>
-            <w:r>
-              <w:rPr>
-                <w:rFonts w:asciiTheme="majorHAnsi" w:hAnsiTheme="majorHAnsi" w:cstheme="majorHAnsi"/>
-                <w:b/>
-                <w:bCs/>
-                <w:color w:val="2B6CB0"/>
-                <w:sz w:val="19"/>
-                <w:szCs w:val="19"/>
-              </w:rPr>
-              <w:t>Virtusa Singapore Pte Ltd — Private Bank (One FCC / ROME / GT FNA)</w:t>
-            </w:r>
-            <w:r>
-              <w:rPr>
-                <w:rFonts w:asciiTheme="majorHAnsi" w:hAnsiTheme="majorHAnsi" w:cstheme="majorHAnsi"/>
-                <w:color w:val="555555"/>
-                <w:sz w:val="18"/>
-                <w:szCs w:val="18"/>
-              </w:rPr>
-              <w:tab/>
-              <w:t>Singapore</w:t>
+              <w:t>Partnered with architecture and QA teams to validate agent-generated code against enterprise coding standards and platform guardrails.</w:t>
             </w:r>
           </w:p>
           <w:p>
@@ -598,28 +856,11 @@
             <w:r>
               <w:rPr>
                 <w:rFonts w:asciiTheme="majorHAnsi" w:hAnsiTheme="majorHAnsi" w:cstheme="majorHAnsi"/>
-                <w:sz w:val="18"/>
-                <w:szCs w:val="18"/>
-              </w:rPr>
-              <w:t xml:space="preserve">Built initial OpenAI agents SDK-based proof-of-concepts for internal tooling, including a research assistant which helps user do a </w:t>
-            </w:r>
-            <w:r>
-              <w:rPr>
-                <w:rFonts w:asciiTheme="majorHAnsi" w:hAnsiTheme="majorHAnsi" w:cstheme="majorHAnsi"/>
-                <w:b/>
-                <w:bCs/>
-                <w:sz w:val="18"/>
-                <w:szCs w:val="18"/>
-              </w:rPr>
-              <w:t>deep research</w:t>
-            </w:r>
-            <w:r>
-              <w:rPr>
-                <w:rFonts w:asciiTheme="majorHAnsi" w:hAnsiTheme="majorHAnsi" w:cstheme="majorHAnsi"/>
-                <w:sz w:val="18"/>
-                <w:szCs w:val="18"/>
-              </w:rPr>
-              <w:t xml:space="preserve"> on a given topic.</w:t>
+                <w:color w:val="333333"/>
+                <w:sz w:val="18"/>
+                <w:szCs w:val="18"/>
+              </w:rPr>
+              <w:t>Designed technical solutions from requirements, factoring in security, maintainability, and extensibility; resolved business-critical issues swiftly.</w:t>
             </w:r>
           </w:p>
           <w:p>
@@ -639,74 +880,84 @@
             <w:r>
               <w:rPr>
                 <w:rFonts w:asciiTheme="majorHAnsi" w:hAnsiTheme="majorHAnsi" w:cstheme="majorHAnsi"/>
-                <w:sz w:val="18"/>
-                <w:szCs w:val="18"/>
-              </w:rPr>
-              <w:t xml:space="preserve">Designed and developed a multi-step </w:t>
-            </w:r>
-            <w:r>
-              <w:rPr>
-                <w:rFonts w:asciiTheme="majorHAnsi" w:hAnsiTheme="majorHAnsi" w:cstheme="majorHAnsi"/>
-                <w:b/>
-                <w:bCs/>
-                <w:sz w:val="18"/>
-                <w:szCs w:val="18"/>
-              </w:rPr>
-              <w:t>Deep Research AI Agent</w:t>
-            </w:r>
-            <w:r>
-              <w:rPr>
-                <w:rFonts w:asciiTheme="majorHAnsi" w:hAnsiTheme="majorHAnsi" w:cstheme="majorHAnsi"/>
-                <w:sz w:val="18"/>
-                <w:szCs w:val="18"/>
-              </w:rPr>
-              <w:t xml:space="preserve"> using Python, OpenAI agents SDK, and Pydantic that automatically decomposes complex user queries into multiple research topics, orchestrates parallel LLM-based research, synthesizes findings, and generates comprehensive, structured reports, </w:t>
-            </w:r>
-            <w:r>
-              <w:rPr>
-                <w:rFonts w:asciiTheme="majorHAnsi" w:hAnsiTheme="majorHAnsi" w:cstheme="majorHAnsi"/>
-                <w:b/>
-                <w:bCs/>
-                <w:sz w:val="18"/>
-                <w:szCs w:val="18"/>
-              </w:rPr>
-              <w:t>reducing</w:t>
-            </w:r>
-            <w:r>
-              <w:rPr>
-                <w:rFonts w:asciiTheme="majorHAnsi" w:hAnsiTheme="majorHAnsi" w:cstheme="majorHAnsi"/>
-                <w:sz w:val="18"/>
-                <w:szCs w:val="18"/>
-              </w:rPr>
-              <w:t xml:space="preserve"> manual research effort by approximately </w:t>
-            </w:r>
-            <w:r>
-              <w:rPr>
-                <w:rFonts w:asciiTheme="majorHAnsi" w:hAnsiTheme="majorHAnsi" w:cstheme="majorHAnsi"/>
-                <w:b/>
-                <w:bCs/>
-                <w:sz w:val="18"/>
-                <w:szCs w:val="18"/>
-              </w:rPr>
-              <w:t>5</w:t>
-            </w:r>
-            <w:r>
-              <w:rPr>
-                <w:rFonts w:asciiTheme="majorHAnsi" w:hAnsiTheme="majorHAnsi" w:cstheme="majorHAnsi"/>
-                <w:b/>
-                <w:bCs/>
-                <w:sz w:val="18"/>
-                <w:szCs w:val="18"/>
-              </w:rPr>
-              <w:t>0%</w:t>
-            </w:r>
-            <w:r>
-              <w:rPr>
-                <w:rFonts w:asciiTheme="majorHAnsi" w:hAnsiTheme="majorHAnsi" w:cstheme="majorHAnsi"/>
-                <w:sz w:val="18"/>
-                <w:szCs w:val="18"/>
-              </w:rPr>
-              <w:t>.</w:t>
+                <w:color w:val="333333"/>
+                <w:sz w:val="18"/>
+                <w:szCs w:val="18"/>
+              </w:rPr>
+              <w:t>Ensured teams followed SDLC practices and adhered to architecture and platform guardrails and best practices.</w:t>
+            </w:r>
+          </w:p>
+          <w:p>
+            <w:pPr>
+              <w:spacing w:after="120"/>
+              <w:rPr>
+                <w:rFonts w:asciiTheme="majorHAnsi" w:hAnsiTheme="majorHAnsi" w:cstheme="majorHAnsi"/>
+              </w:rPr>
+            </w:pPr>
+          </w:p>
+          <w:p>
+            <w:pPr>
+              <w:tabs>
+                <w:tab w:val="right" w:pos="5760"/>
+              </w:tabs>
+              <w:rPr>
+                <w:rFonts w:asciiTheme="majorHAnsi" w:hAnsiTheme="majorHAnsi" w:cstheme="majorHAnsi"/>
+              </w:rPr>
+            </w:pPr>
+            <w:r>
+              <w:rPr>
+                <w:rFonts w:asciiTheme="majorHAnsi" w:hAnsiTheme="majorHAnsi" w:cstheme="majorHAnsi"/>
+                <w:b/>
+                <w:bCs/>
+                <w:color w:val="1B1B1B"/>
+                <w:sz w:val="21"/>
+                <w:szCs w:val="21"/>
+              </w:rPr>
+              <w:t>Lead Consultant</w:t>
+            </w:r>
+            <w:r>
+              <w:rPr>
+                <w:rFonts w:asciiTheme="majorHAnsi" w:hAnsiTheme="majorHAnsi" w:cstheme="majorHAnsi"/>
+                <w:i/>
+                <w:iCs/>
+                <w:color w:val="555555"/>
+                <w:sz w:val="18"/>
+                <w:szCs w:val="18"/>
+              </w:rPr>
+              <w:tab/>
+              <w:t>Jun 2023 – Aug 2024</w:t>
+            </w:r>
+          </w:p>
+          <w:p>
+            <w:pPr>
+              <w:tabs>
+                <w:tab w:val="right" w:pos="5760"/>
+              </w:tabs>
+              <w:spacing w:after="60"/>
+              <w:rPr>
+                <w:rFonts w:asciiTheme="majorHAnsi" w:hAnsiTheme="majorHAnsi" w:cstheme="majorHAnsi"/>
+              </w:rPr>
+            </w:pPr>
+            <w:r>
+              <w:rPr>
+                <w:rFonts w:asciiTheme="majorHAnsi" w:hAnsiTheme="majorHAnsi" w:cstheme="majorHAnsi"/>
+                <w:b/>
+                <w:bCs/>
+                <w:color w:val="2B6CB0"/>
+                <w:sz w:val="19"/>
+                <w:szCs w:val="19"/>
+              </w:rPr>
+              <w:t>Virtusa Singapore Pte Ltd — Private Bank (One FCC / ROME / GT FNA)</w:t>
+            </w:r>
+            <w:r>
+              <w:rPr>
+                <w:rFonts w:asciiTheme="majorHAnsi" w:hAnsiTheme="majorHAnsi" w:cstheme="majorHAnsi"/>
+                <w:color w:val="555555"/>
+                <w:sz w:val="18"/>
+                <w:szCs w:val="18"/>
+              </w:rPr>
+              <w:tab/>
+              <w:t>Singapore</w:t>
             </w:r>
           </w:p>
           <w:p>
@@ -726,11 +977,38 @@
             <w:r>
               <w:rPr>
                 <w:rFonts w:asciiTheme="majorHAnsi" w:hAnsiTheme="majorHAnsi" w:cstheme="majorHAnsi"/>
-                <w:color w:val="333333"/>
-                <w:sz w:val="18"/>
-                <w:szCs w:val="18"/>
-              </w:rPr>
-              <w:t>Owned end-to-end delivery of two applications, from case lifecycle design and data modelling to UI and REST API integration.</w:t>
+                <w:sz w:val="18"/>
+                <w:szCs w:val="18"/>
+              </w:rPr>
+              <w:t xml:space="preserve">Built initial OpenAI agents SDK-based proof-of-concepts for internal tooling, including a research assistant which helps user do </w:t>
+            </w:r>
+            <w:proofErr w:type="gramStart"/>
+            <w:r>
+              <w:rPr>
+                <w:rFonts w:asciiTheme="majorHAnsi" w:hAnsiTheme="majorHAnsi" w:cstheme="majorHAnsi"/>
+                <w:sz w:val="18"/>
+                <w:szCs w:val="18"/>
+              </w:rPr>
+              <w:t xml:space="preserve">a </w:t>
+            </w:r>
+            <w:r>
+              <w:rPr>
+                <w:rFonts w:asciiTheme="majorHAnsi" w:hAnsiTheme="majorHAnsi" w:cstheme="majorHAnsi"/>
+                <w:b/>
+                <w:bCs/>
+                <w:sz w:val="18"/>
+                <w:szCs w:val="18"/>
+              </w:rPr>
+              <w:t>deep research</w:t>
+            </w:r>
+            <w:proofErr w:type="gramEnd"/>
+            <w:r>
+              <w:rPr>
+                <w:rFonts w:asciiTheme="majorHAnsi" w:hAnsiTheme="majorHAnsi" w:cstheme="majorHAnsi"/>
+                <w:sz w:val="18"/>
+                <w:szCs w:val="18"/>
+              </w:rPr>
+              <w:t xml:space="preserve"> on a given topic.</w:t>
             </w:r>
           </w:p>
           <w:p>
@@ -750,11 +1028,74 @@
             <w:r>
               <w:rPr>
                 <w:rFonts w:asciiTheme="majorHAnsi" w:hAnsiTheme="majorHAnsi" w:cstheme="majorHAnsi"/>
-                <w:color w:val="333333"/>
-                <w:sz w:val="18"/>
-                <w:szCs w:val="18"/>
-              </w:rPr>
-              <w:t>Collaborated with stakeholders to translate functional requirements into scalable, high-performance technical designs.</w:t>
+                <w:sz w:val="18"/>
+                <w:szCs w:val="18"/>
+              </w:rPr>
+              <w:t xml:space="preserve">Designed and developed a multi-step </w:t>
+            </w:r>
+            <w:r>
+              <w:rPr>
+                <w:rFonts w:asciiTheme="majorHAnsi" w:hAnsiTheme="majorHAnsi" w:cstheme="majorHAnsi"/>
+                <w:b/>
+                <w:bCs/>
+                <w:sz w:val="18"/>
+                <w:szCs w:val="18"/>
+              </w:rPr>
+              <w:t>Deep Research AI Agent</w:t>
+            </w:r>
+            <w:r>
+              <w:rPr>
+                <w:rFonts w:asciiTheme="majorHAnsi" w:hAnsiTheme="majorHAnsi" w:cstheme="majorHAnsi"/>
+                <w:sz w:val="18"/>
+                <w:szCs w:val="18"/>
+              </w:rPr>
+              <w:t xml:space="preserve"> using Python, OpenAI agents SDK, and Pydantic that automatically decomposes complex user queries into multiple research topics, orchestrates parallel LLM-based research, synthesizes findings, and generates comprehensive, structured reports, </w:t>
+            </w:r>
+            <w:r>
+              <w:rPr>
+                <w:rFonts w:asciiTheme="majorHAnsi" w:hAnsiTheme="majorHAnsi" w:cstheme="majorHAnsi"/>
+                <w:b/>
+                <w:bCs/>
+                <w:sz w:val="18"/>
+                <w:szCs w:val="18"/>
+              </w:rPr>
+              <w:t>reducing</w:t>
+            </w:r>
+            <w:r>
+              <w:rPr>
+                <w:rFonts w:asciiTheme="majorHAnsi" w:hAnsiTheme="majorHAnsi" w:cstheme="majorHAnsi"/>
+                <w:sz w:val="18"/>
+                <w:szCs w:val="18"/>
+              </w:rPr>
+              <w:t xml:space="preserve"> manual research effort by approximately </w:t>
+            </w:r>
+            <w:r>
+              <w:rPr>
+                <w:rFonts w:asciiTheme="majorHAnsi" w:hAnsiTheme="majorHAnsi" w:cstheme="majorHAnsi"/>
+                <w:b/>
+                <w:bCs/>
+                <w:sz w:val="18"/>
+                <w:szCs w:val="18"/>
+              </w:rPr>
+              <w:t>5</w:t>
+            </w:r>
+            <w:r>
+              <w:rPr>
+                <w:rFonts w:asciiTheme="majorHAnsi" w:hAnsiTheme="majorHAnsi" w:cstheme="majorHAnsi"/>
+                <w:b/>
+                <w:bCs/>
+                <w:sz w:val="18"/>
+                <w:szCs w:val="18"/>
+              </w:rPr>
+              <w:t>0%</w:t>
+            </w:r>
+            <w:r>
+              <w:rPr>
+                <w:rFonts w:asciiTheme="majorHAnsi" w:hAnsiTheme="majorHAnsi" w:cstheme="majorHAnsi"/>
+                <w:sz w:val="18"/>
+                <w:szCs w:val="18"/>
+              </w:rPr>
+              <w:t>.</w:t>
             </w:r>
           </w:p>
           <w:p>
@@ -774,84 +1115,20 @@
             <w:r>
               <w:rPr>
                 <w:rFonts w:asciiTheme="majorHAnsi" w:hAnsiTheme="majorHAnsi" w:cstheme="majorHAnsi"/>
-                <w:color w:val="333333"/>
-                <w:sz w:val="18"/>
-                <w:szCs w:val="18"/>
-              </w:rPr>
-              <w:t>Supported SIT/UAT testing and go-live activities, including hyper-care.</w:t>
-            </w:r>
-          </w:p>
-          <w:p>
-            <w:pPr>
-              <w:spacing w:after="120"/>
-              <w:rPr>
-                <w:rFonts w:asciiTheme="majorHAnsi" w:hAnsiTheme="majorHAnsi" w:cstheme="majorHAnsi"/>
-              </w:rPr>
-            </w:pPr>
-          </w:p>
-          <w:p>
-            <w:pPr>
-              <w:tabs>
-                <w:tab w:val="right" w:pos="5760"/>
-              </w:tabs>
-              <w:rPr>
-                <w:rFonts w:asciiTheme="majorHAnsi" w:hAnsiTheme="majorHAnsi" w:cstheme="majorHAnsi"/>
-              </w:rPr>
-            </w:pPr>
-            <w:r>
-              <w:rPr>
-                <w:rFonts w:asciiTheme="majorHAnsi" w:hAnsiTheme="majorHAnsi" w:cstheme="majorHAnsi"/>
-                <w:b/>
-                <w:bCs/>
-                <w:color w:val="1B1B1B"/>
-                <w:sz w:val="21"/>
-                <w:szCs w:val="21"/>
-              </w:rPr>
-              <w:t>Associate Architect (Low-Code / Pega)</w:t>
-            </w:r>
-            <w:r>
-              <w:rPr>
-                <w:rFonts w:asciiTheme="majorHAnsi" w:hAnsiTheme="majorHAnsi" w:cstheme="majorHAnsi"/>
-                <w:i/>
-                <w:iCs/>
-                <w:color w:val="555555"/>
-                <w:sz w:val="18"/>
-                <w:szCs w:val="18"/>
-              </w:rPr>
-              <w:tab/>
-              <w:t>Mar 2021 – Mar 2023</w:t>
-            </w:r>
-          </w:p>
-          <w:p>
-            <w:pPr>
-              <w:tabs>
-                <w:tab w:val="right" w:pos="5760"/>
-              </w:tabs>
-              <w:spacing w:after="60"/>
-              <w:rPr>
-                <w:rFonts w:asciiTheme="majorHAnsi" w:hAnsiTheme="majorHAnsi" w:cstheme="majorHAnsi"/>
-              </w:rPr>
-            </w:pPr>
-            <w:r>
-              <w:rPr>
-                <w:rFonts w:asciiTheme="majorHAnsi" w:hAnsiTheme="majorHAnsi" w:cstheme="majorHAnsi"/>
-                <w:b/>
-                <w:bCs/>
-                <w:color w:val="2B6CB0"/>
-                <w:sz w:val="19"/>
-                <w:szCs w:val="19"/>
-              </w:rPr>
-              <w:t>NCS Singapore Pte Ltd — Singapore Government (Case Management System)</w:t>
-            </w:r>
-            <w:r>
-              <w:rPr>
-                <w:rFonts w:asciiTheme="majorHAnsi" w:hAnsiTheme="majorHAnsi" w:cstheme="majorHAnsi"/>
-                <w:color w:val="555555"/>
-                <w:sz w:val="18"/>
-                <w:szCs w:val="18"/>
-              </w:rPr>
-              <w:tab/>
-              <w:t>Singapore</w:t>
+                <w:b/>
+                <w:bCs/>
+                <w:sz w:val="18"/>
+                <w:szCs w:val="18"/>
+              </w:rPr>
+              <w:t>Improved</w:t>
+            </w:r>
+            <w:r>
+              <w:rPr>
+                <w:rFonts w:asciiTheme="majorHAnsi" w:hAnsiTheme="majorHAnsi" w:cstheme="majorHAnsi"/>
+                <w:sz w:val="18"/>
+                <w:szCs w:val="18"/>
+              </w:rPr>
+              <w:t xml:space="preserve"> research accuracy by validating AI-generated responses against multiple trusted sources before presenting the final result.</w:t>
             </w:r>
           </w:p>
           <w:p>
@@ -875,7 +1152,7 @@
                 <w:sz w:val="18"/>
                 <w:szCs w:val="18"/>
               </w:rPr>
-              <w:t>Led a large migration module, mentoring a 5-member team through code reviews, task allocation, and root-cause analysis of production issues.</w:t>
+              <w:t>Owned end-to-end delivery of two applications, from case lifecycle design and data modelling to UI and REST API integration.</w:t>
             </w:r>
           </w:p>
           <w:p>
@@ -899,81 +1176,7 @@
                 <w:sz w:val="18"/>
                 <w:szCs w:val="18"/>
               </w:rPr>
-              <w:lastRenderedPageBreak/>
-              <w:t>Provided architecture guidance across data models, integrations, and case-management workflows.</w:t>
-            </w:r>
-          </w:p>
-          <w:p>
-            <w:pPr>
-              <w:spacing w:after="120"/>
-              <w:rPr>
-                <w:rFonts w:asciiTheme="majorHAnsi" w:hAnsiTheme="majorHAnsi" w:cstheme="majorHAnsi"/>
-              </w:rPr>
-            </w:pPr>
-          </w:p>
-          <w:p>
-            <w:pPr>
-              <w:tabs>
-                <w:tab w:val="right" w:pos="5760"/>
-              </w:tabs>
-              <w:rPr>
-                <w:rFonts w:asciiTheme="majorHAnsi" w:hAnsiTheme="majorHAnsi" w:cstheme="majorHAnsi"/>
-              </w:rPr>
-            </w:pPr>
-            <w:r>
-              <w:rPr>
-                <w:rFonts w:asciiTheme="majorHAnsi" w:hAnsiTheme="majorHAnsi" w:cstheme="majorHAnsi"/>
-                <w:b/>
-                <w:bCs/>
-                <w:color w:val="1B1B1B"/>
-                <w:sz w:val="21"/>
-                <w:szCs w:val="21"/>
-              </w:rPr>
-              <w:t>Technical Architect (Low-Code / Pega)</w:t>
-            </w:r>
-            <w:r>
-              <w:rPr>
-                <w:rFonts w:asciiTheme="majorHAnsi" w:hAnsiTheme="majorHAnsi" w:cstheme="majorHAnsi"/>
-                <w:i/>
-                <w:iCs/>
-                <w:color w:val="555555"/>
-                <w:sz w:val="18"/>
-                <w:szCs w:val="18"/>
-              </w:rPr>
-              <w:tab/>
-              <w:t>Apr 2016 – Mar 2021</w:t>
-            </w:r>
-          </w:p>
-          <w:p>
-            <w:pPr>
-              <w:tabs>
-                <w:tab w:val="right" w:pos="5760"/>
-              </w:tabs>
-              <w:spacing w:after="60"/>
-              <w:rPr>
-                <w:rFonts w:asciiTheme="majorHAnsi" w:hAnsiTheme="majorHAnsi" w:cstheme="majorHAnsi"/>
-              </w:rPr>
-            </w:pPr>
-            <w:r>
-              <w:rPr>
-                <w:rFonts w:asciiTheme="majorHAnsi" w:hAnsiTheme="majorHAnsi" w:cstheme="majorHAnsi"/>
-                <w:b/>
-                <w:bCs/>
-                <w:color w:val="2B6CB0"/>
-                <w:sz w:val="19"/>
-                <w:szCs w:val="19"/>
-              </w:rPr>
-              <w:t>HCL Singapore Pte Ltd — Private Bank (Client Onboarding)</w:t>
-            </w:r>
-            <w:r>
-              <w:rPr>
-                <w:rFonts w:asciiTheme="majorHAnsi" w:hAnsiTheme="majorHAnsi" w:cstheme="majorHAnsi"/>
-                <w:color w:val="555555"/>
-                <w:sz w:val="18"/>
-                <w:szCs w:val="18"/>
-              </w:rPr>
-              <w:tab/>
-              <w:t>Singapore</w:t>
+              <w:t>Collaborated with stakeholders to translate functional requirements into scalable, high-performance technical designs.</w:t>
             </w:r>
           </w:p>
           <w:p>
@@ -997,7 +1200,81 @@
                 <w:sz w:val="18"/>
                 <w:szCs w:val="18"/>
               </w:rPr>
-              <w:t>Delivered a large client-onboarding platform on Pega PRPC 7.1.7, contributing to architecture, development, and production support.</w:t>
+              <w:t>Supported SIT/UAT testing and go-live activities, including hyper-care.</w:t>
+            </w:r>
+          </w:p>
+          <w:p>
+            <w:pPr>
+              <w:spacing w:after="120"/>
+              <w:rPr>
+                <w:rFonts w:asciiTheme="majorHAnsi" w:hAnsiTheme="majorHAnsi" w:cstheme="majorHAnsi"/>
+              </w:rPr>
+            </w:pPr>
+          </w:p>
+          <w:p>
+            <w:pPr>
+              <w:tabs>
+                <w:tab w:val="right" w:pos="5760"/>
+              </w:tabs>
+              <w:rPr>
+                <w:rFonts w:asciiTheme="majorHAnsi" w:hAnsiTheme="majorHAnsi" w:cstheme="majorHAnsi"/>
+              </w:rPr>
+            </w:pPr>
+            <w:r>
+              <w:rPr>
+                <w:rFonts w:asciiTheme="majorHAnsi" w:hAnsiTheme="majorHAnsi" w:cstheme="majorHAnsi"/>
+                <w:b/>
+                <w:bCs/>
+                <w:color w:val="1B1B1B"/>
+                <w:sz w:val="21"/>
+                <w:szCs w:val="21"/>
+              </w:rPr>
+              <w:lastRenderedPageBreak/>
+              <w:t>Associate Architect (Low-Code / Pega)</w:t>
+            </w:r>
+            <w:r>
+              <w:rPr>
+                <w:rFonts w:asciiTheme="majorHAnsi" w:hAnsiTheme="majorHAnsi" w:cstheme="majorHAnsi"/>
+                <w:i/>
+                <w:iCs/>
+                <w:color w:val="555555"/>
+                <w:sz w:val="18"/>
+                <w:szCs w:val="18"/>
+              </w:rPr>
+              <w:tab/>
+              <w:t>Mar 2021 – Mar 2023</w:t>
+            </w:r>
+          </w:p>
+          <w:p>
+            <w:pPr>
+              <w:tabs>
+                <w:tab w:val="right" w:pos="5760"/>
+              </w:tabs>
+              <w:spacing w:after="60"/>
+              <w:rPr>
+                <w:rFonts w:asciiTheme="majorHAnsi" w:hAnsiTheme="majorHAnsi" w:cstheme="majorHAnsi"/>
+              </w:rPr>
+            </w:pPr>
+            <w:r>
+              <w:rPr>
+                <w:rFonts w:asciiTheme="majorHAnsi" w:hAnsiTheme="majorHAnsi" w:cstheme="majorHAnsi"/>
+                <w:b/>
+                <w:bCs/>
+                <w:color w:val="2B6CB0"/>
+                <w:sz w:val="19"/>
+                <w:szCs w:val="19"/>
+              </w:rPr>
+              <w:t>NCS Singapore Pte Ltd — Singapore Government (Case Management System)</w:t>
+            </w:r>
+            <w:r>
+              <w:rPr>
+                <w:rFonts w:asciiTheme="majorHAnsi" w:hAnsiTheme="majorHAnsi" w:cstheme="majorHAnsi"/>
+                <w:color w:val="555555"/>
+                <w:sz w:val="18"/>
+                <w:szCs w:val="18"/>
+              </w:rPr>
+              <w:tab/>
+              <w:t>Singapore</w:t>
             </w:r>
           </w:p>
           <w:p>
@@ -1021,80 +1298,7 @@
                 <w:sz w:val="18"/>
                 <w:szCs w:val="18"/>
               </w:rPr>
-              <w:t>Received the O-Infinity Award for exceeding expectations for two consecutive years.</w:t>
-            </w:r>
-          </w:p>
-          <w:p>
-            <w:pPr>
-              <w:spacing w:after="120"/>
-              <w:rPr>
-                <w:rFonts w:asciiTheme="majorHAnsi" w:hAnsiTheme="majorHAnsi" w:cstheme="majorHAnsi"/>
-              </w:rPr>
-            </w:pPr>
-          </w:p>
-          <w:p>
-            <w:pPr>
-              <w:tabs>
-                <w:tab w:val="right" w:pos="5760"/>
-              </w:tabs>
-              <w:rPr>
-                <w:rFonts w:asciiTheme="majorHAnsi" w:hAnsiTheme="majorHAnsi" w:cstheme="majorHAnsi"/>
-              </w:rPr>
-            </w:pPr>
-            <w:r>
-              <w:rPr>
-                <w:rFonts w:asciiTheme="majorHAnsi" w:hAnsiTheme="majorHAnsi" w:cstheme="majorHAnsi"/>
-                <w:b/>
-                <w:bCs/>
-                <w:color w:val="1B1B1B"/>
-                <w:sz w:val="21"/>
-                <w:szCs w:val="21"/>
-              </w:rPr>
-              <w:t>Delivery Module Lead</w:t>
-            </w:r>
-            <w:r>
-              <w:rPr>
-                <w:rFonts w:asciiTheme="majorHAnsi" w:hAnsiTheme="majorHAnsi" w:cstheme="majorHAnsi"/>
-                <w:i/>
-                <w:iCs/>
-                <w:color w:val="555555"/>
-                <w:sz w:val="18"/>
-                <w:szCs w:val="18"/>
-              </w:rPr>
-              <w:tab/>
-              <w:t>Dec 2014 – Apr 2016</w:t>
-            </w:r>
-          </w:p>
-          <w:p>
-            <w:pPr>
-              <w:tabs>
-                <w:tab w:val="right" w:pos="5760"/>
-              </w:tabs>
-              <w:spacing w:after="60"/>
-              <w:rPr>
-                <w:rFonts w:asciiTheme="majorHAnsi" w:hAnsiTheme="majorHAnsi" w:cstheme="majorHAnsi"/>
-              </w:rPr>
-            </w:pPr>
-            <w:r>
-              <w:rPr>
-                <w:rFonts w:asciiTheme="majorHAnsi" w:hAnsiTheme="majorHAnsi" w:cstheme="majorHAnsi"/>
-                <w:b/>
-                <w:bCs/>
-                <w:color w:val="2B6CB0"/>
-                <w:sz w:val="19"/>
-                <w:szCs w:val="19"/>
-              </w:rPr>
-              <w:t>Mphasis Ltd</w:t>
-            </w:r>
-            <w:r>
-              <w:rPr>
-                <w:rFonts w:asciiTheme="majorHAnsi" w:hAnsiTheme="majorHAnsi" w:cstheme="majorHAnsi"/>
-                <w:color w:val="555555"/>
-                <w:sz w:val="18"/>
-                <w:szCs w:val="18"/>
-              </w:rPr>
-              <w:tab/>
-              <w:t>Hyderabad, India</w:t>
+              <w:t>Led a large migration module, mentoring a 5-member team through code reviews, task allocation, and root-cause analysis of production issues.</w:t>
             </w:r>
           </w:p>
           <w:p>
@@ -1118,7 +1322,7 @@
                 <w:sz w:val="18"/>
                 <w:szCs w:val="18"/>
               </w:rPr>
-              <w:t>Led delivery of application modules, coordinating development and testing activities.</w:t>
+              <w:t>Provided architecture guidance across data models, integrations, and case-management workflows.</w:t>
             </w:r>
           </w:p>
           <w:p>
@@ -1147,7 +1351,7 @@
                 <w:sz w:val="21"/>
                 <w:szCs w:val="21"/>
               </w:rPr>
-              <w:t>Application Developer</w:t>
+              <w:t>Technical Architect (Low-Code / Pega)</w:t>
             </w:r>
             <w:r>
               <w:rPr>
@@ -1159,7 +1363,7 @@
                 <w:szCs w:val="18"/>
               </w:rPr>
               <w:tab/>
-              <w:t>Dec 2010 – Dec 2014</w:t>
+              <w:t>Apr 2016 – Mar 2021</w:t>
             </w:r>
           </w:p>
           <w:p>
@@ -1181,7 +1385,7 @@
                 <w:sz w:val="19"/>
                 <w:szCs w:val="19"/>
               </w:rPr>
-              <w:t>Virtusa Consulting — UnitedHealth Group</w:t>
+              <w:t>HCL Singapore Pte Ltd — Private Bank (Client Onboarding)</w:t>
             </w:r>
             <w:r>
               <w:rPr>
@@ -1191,7 +1395,7 @@
                 <w:szCs w:val="18"/>
               </w:rPr>
               <w:tab/>
-              <w:t>Hyderabad, India</w:t>
+              <w:t>Singapore</w:t>
             </w:r>
           </w:p>
           <w:p>
@@ -1215,6 +1419,224 @@
                 <w:sz w:val="18"/>
                 <w:szCs w:val="18"/>
               </w:rPr>
+              <w:t>Delivered a large client-onboarding platform on Pega PRPC 7.1.7, contributing to architecture, development, and production support.</w:t>
+            </w:r>
+          </w:p>
+          <w:p>
+            <w:pPr>
+              <w:pStyle w:val="ListParagraph"/>
+              <w:numPr>
+                <w:ilvl w:val="0"/>
+                <w:numId w:val="1"/>
+              </w:numPr>
+              <w:spacing w:after="40"/>
+              <w:rPr>
+                <w:rFonts w:asciiTheme="majorHAnsi" w:hAnsiTheme="majorHAnsi" w:cstheme="majorHAnsi"/>
+                <w:sz w:val="18"/>
+                <w:szCs w:val="18"/>
+              </w:rPr>
+            </w:pPr>
+            <w:r>
+              <w:rPr>
+                <w:rFonts w:asciiTheme="majorHAnsi" w:hAnsiTheme="majorHAnsi" w:cstheme="majorHAnsi"/>
+                <w:color w:val="333333"/>
+                <w:sz w:val="18"/>
+                <w:szCs w:val="18"/>
+              </w:rPr>
+              <w:t>Received the O-Infinity Award for exceeding expectations for two consecutive years.</w:t>
+            </w:r>
+          </w:p>
+          <w:p>
+            <w:pPr>
+              <w:spacing w:after="120"/>
+              <w:rPr>
+                <w:rFonts w:asciiTheme="majorHAnsi" w:hAnsiTheme="majorHAnsi" w:cstheme="majorHAnsi"/>
+              </w:rPr>
+            </w:pPr>
+          </w:p>
+          <w:p>
+            <w:pPr>
+              <w:tabs>
+                <w:tab w:val="right" w:pos="5760"/>
+              </w:tabs>
+              <w:rPr>
+                <w:rFonts w:asciiTheme="majorHAnsi" w:hAnsiTheme="majorHAnsi" w:cstheme="majorHAnsi"/>
+              </w:rPr>
+            </w:pPr>
+            <w:r>
+              <w:rPr>
+                <w:rFonts w:asciiTheme="majorHAnsi" w:hAnsiTheme="majorHAnsi" w:cstheme="majorHAnsi"/>
+                <w:b/>
+                <w:bCs/>
+                <w:color w:val="1B1B1B"/>
+                <w:sz w:val="21"/>
+                <w:szCs w:val="21"/>
+              </w:rPr>
+              <w:t>Delivery Module Lead</w:t>
+            </w:r>
+            <w:r>
+              <w:rPr>
+                <w:rFonts w:asciiTheme="majorHAnsi" w:hAnsiTheme="majorHAnsi" w:cstheme="majorHAnsi"/>
+                <w:i/>
+                <w:iCs/>
+                <w:color w:val="555555"/>
+                <w:sz w:val="18"/>
+                <w:szCs w:val="18"/>
+              </w:rPr>
+              <w:tab/>
+              <w:t>Dec 2014 – Apr 2016</w:t>
+            </w:r>
+          </w:p>
+          <w:p>
+            <w:pPr>
+              <w:tabs>
+                <w:tab w:val="right" w:pos="5760"/>
+              </w:tabs>
+              <w:spacing w:after="60"/>
+              <w:rPr>
+                <w:rFonts w:asciiTheme="majorHAnsi" w:hAnsiTheme="majorHAnsi" w:cstheme="majorHAnsi"/>
+              </w:rPr>
+            </w:pPr>
+            <w:r>
+              <w:rPr>
+                <w:rFonts w:asciiTheme="majorHAnsi" w:hAnsiTheme="majorHAnsi" w:cstheme="majorHAnsi"/>
+                <w:b/>
+                <w:bCs/>
+                <w:color w:val="2B6CB0"/>
+                <w:sz w:val="19"/>
+                <w:szCs w:val="19"/>
+              </w:rPr>
+              <w:t>Mphasis Ltd</w:t>
+            </w:r>
+            <w:r>
+              <w:rPr>
+                <w:rFonts w:asciiTheme="majorHAnsi" w:hAnsiTheme="majorHAnsi" w:cstheme="majorHAnsi"/>
+                <w:color w:val="555555"/>
+                <w:sz w:val="18"/>
+                <w:szCs w:val="18"/>
+              </w:rPr>
+              <w:tab/>
+              <w:t>Hyderabad, India</w:t>
+            </w:r>
+          </w:p>
+          <w:p>
+            <w:pPr>
+              <w:pStyle w:val="ListParagraph"/>
+              <w:numPr>
+                <w:ilvl w:val="0"/>
+                <w:numId w:val="1"/>
+              </w:numPr>
+              <w:spacing w:after="40"/>
+              <w:rPr>
+                <w:rFonts w:asciiTheme="majorHAnsi" w:hAnsiTheme="majorHAnsi" w:cstheme="majorHAnsi"/>
+                <w:sz w:val="18"/>
+                <w:szCs w:val="18"/>
+              </w:rPr>
+            </w:pPr>
+            <w:r>
+              <w:rPr>
+                <w:rFonts w:asciiTheme="majorHAnsi" w:hAnsiTheme="majorHAnsi" w:cstheme="majorHAnsi"/>
+                <w:color w:val="333333"/>
+                <w:sz w:val="18"/>
+                <w:szCs w:val="18"/>
+              </w:rPr>
+              <w:t>Led delivery of application modules, coordinating development and testing activities.</w:t>
+            </w:r>
+          </w:p>
+          <w:p>
+            <w:pPr>
+              <w:spacing w:after="120"/>
+              <w:rPr>
+                <w:rFonts w:asciiTheme="majorHAnsi" w:hAnsiTheme="majorHAnsi" w:cstheme="majorHAnsi"/>
+              </w:rPr>
+            </w:pPr>
+          </w:p>
+          <w:p>
+            <w:pPr>
+              <w:tabs>
+                <w:tab w:val="right" w:pos="5760"/>
+              </w:tabs>
+              <w:rPr>
+                <w:rFonts w:asciiTheme="majorHAnsi" w:hAnsiTheme="majorHAnsi" w:cstheme="majorHAnsi"/>
+              </w:rPr>
+            </w:pPr>
+            <w:r>
+              <w:rPr>
+                <w:rFonts w:asciiTheme="majorHAnsi" w:hAnsiTheme="majorHAnsi" w:cstheme="majorHAnsi"/>
+                <w:b/>
+                <w:bCs/>
+                <w:color w:val="1B1B1B"/>
+                <w:sz w:val="21"/>
+                <w:szCs w:val="21"/>
+              </w:rPr>
+              <w:t>Application Developer</w:t>
+            </w:r>
+            <w:r>
+              <w:rPr>
+                <w:rFonts w:asciiTheme="majorHAnsi" w:hAnsiTheme="majorHAnsi" w:cstheme="majorHAnsi"/>
+                <w:i/>
+                <w:iCs/>
+                <w:color w:val="555555"/>
+                <w:sz w:val="18"/>
+                <w:szCs w:val="18"/>
+              </w:rPr>
+              <w:tab/>
+              <w:t>Dec 2010 – Dec 2014</w:t>
+            </w:r>
+          </w:p>
+          <w:p>
+            <w:pPr>
+              <w:tabs>
+                <w:tab w:val="right" w:pos="5760"/>
+              </w:tabs>
+              <w:spacing w:after="60"/>
+              <w:rPr>
+                <w:rFonts w:asciiTheme="majorHAnsi" w:hAnsiTheme="majorHAnsi" w:cstheme="majorHAnsi"/>
+              </w:rPr>
+            </w:pPr>
+            <w:r>
+              <w:rPr>
+                <w:rFonts w:asciiTheme="majorHAnsi" w:hAnsiTheme="majorHAnsi" w:cstheme="majorHAnsi"/>
+                <w:b/>
+                <w:bCs/>
+                <w:color w:val="2B6CB0"/>
+                <w:sz w:val="19"/>
+                <w:szCs w:val="19"/>
+              </w:rPr>
+              <w:t>Virtusa Consulting — UnitedHealth Group</w:t>
+            </w:r>
+            <w:r>
+              <w:rPr>
+                <w:rFonts w:asciiTheme="majorHAnsi" w:hAnsiTheme="majorHAnsi" w:cstheme="majorHAnsi"/>
+                <w:color w:val="555555"/>
+                <w:sz w:val="18"/>
+                <w:szCs w:val="18"/>
+              </w:rPr>
+              <w:tab/>
+              <w:t>Hyderabad, India</w:t>
+            </w:r>
+          </w:p>
+          <w:p>
+            <w:pPr>
+              <w:pStyle w:val="ListParagraph"/>
+              <w:numPr>
+                <w:ilvl w:val="0"/>
+                <w:numId w:val="1"/>
+              </w:numPr>
+              <w:spacing w:after="40"/>
+              <w:rPr>
+                <w:rFonts w:asciiTheme="majorHAnsi" w:hAnsiTheme="majorHAnsi" w:cstheme="majorHAnsi"/>
+                <w:sz w:val="18"/>
+                <w:szCs w:val="18"/>
+              </w:rPr>
+            </w:pPr>
+            <w:r>
+              <w:rPr>
+                <w:rFonts w:asciiTheme="majorHAnsi" w:hAnsiTheme="majorHAnsi" w:cstheme="majorHAnsi"/>
+                <w:color w:val="333333"/>
+                <w:sz w:val="18"/>
+                <w:szCs w:val="18"/>
+              </w:rPr>
               <w:t>Developed and supported enterprise application modules early in career, building foundational software engineering skills.</w:t>
             </w:r>
           </w:p>
@@ -1317,6 +1739,7 @@
                 <w:rFonts w:asciiTheme="majorHAnsi" w:hAnsiTheme="majorHAnsi" w:cstheme="majorHAnsi"/>
               </w:rPr>
             </w:pPr>
+            <w:proofErr w:type="gramStart"/>
             <w:r>
               <w:rPr>
                 <w:rFonts w:asciiTheme="majorHAnsi" w:hAnsiTheme="majorHAnsi" w:cstheme="majorHAnsi"/>
@@ -1326,7 +1749,19 @@
                 <w:sz w:val="21"/>
                 <w:szCs w:val="21"/>
               </w:rPr>
-              <w:t>B.Tech, Computer Science Engineering</w:t>
+              <w:t>B.Tech</w:t>
+            </w:r>
+            <w:proofErr w:type="gramEnd"/>
+            <w:r>
+              <w:rPr>
+                <w:rFonts w:asciiTheme="majorHAnsi" w:hAnsiTheme="majorHAnsi" w:cstheme="majorHAnsi"/>
+                <w:b/>
+                <w:bCs/>
+                <w:color w:val="1B1B1B"/>
+                <w:sz w:val="21"/>
+                <w:szCs w:val="21"/>
+              </w:rPr>
+              <w:t>, Computer Science Engineering</w:t>
             </w:r>
           </w:p>
           <w:p>
@@ -1412,6 +1847,9 @@
               <w:spacing w:after="90"/>
               <w:rPr>
                 <w:rFonts w:asciiTheme="majorHAnsi" w:hAnsiTheme="majorHAnsi" w:cstheme="majorHAnsi"/>
+                <w:color w:val="1F3864"/>
+                <w:sz w:val="18"/>
+                <w:szCs w:val="18"/>
               </w:rPr>
             </w:pPr>
             <w:r>
@@ -1432,15 +1870,17 @@
               </w:rPr>
               <w:t xml:space="preserve">  </w:t>
             </w:r>
-            <w:r>
-              <w:rPr>
-                <w:rFonts w:asciiTheme="majorHAnsi" w:hAnsiTheme="majorHAnsi" w:cstheme="majorHAnsi"/>
-                <w:color w:val="1F3864"/>
-                <w:sz w:val="18"/>
-                <w:szCs w:val="18"/>
-              </w:rPr>
-              <w:t>sumitkalra.ai@gmail.co</w:t>
-            </w:r>
+            <w:hyperlink r:id="rId8" w:history="1">
+              <w:r>
+                <w:rPr>
+                  <w:rStyle w:val="Hyperlink"/>
+                  <w:rFonts w:asciiTheme="majorHAnsi" w:hAnsiTheme="majorHAnsi" w:cstheme="majorHAnsi"/>
+                  <w:sz w:val="18"/>
+                  <w:szCs w:val="18"/>
+                </w:rPr>
+                <w:t>sumitkalra.ai@gmail.com</w:t>
+              </w:r>
+            </w:hyperlink>
           </w:p>
           <w:p>
             <w:pPr>
@@ -1449,6 +1889,7 @@
                 <w:rFonts w:asciiTheme="majorHAnsi" w:hAnsiTheme="majorHAnsi" w:cstheme="majorHAnsi"/>
               </w:rPr>
             </w:pPr>
+            <w:proofErr w:type="gramStart"/>
             <w:r>
               <w:rPr>
                 <w:rFonts w:ascii="Segoe UI Symbol" w:hAnsi="Segoe UI Symbol" w:cs="Segoe UI Symbol"/>
@@ -1465,7 +1906,17 @@
                 <w:sz w:val="18"/>
                 <w:szCs w:val="18"/>
               </w:rPr>
-              <w:t xml:space="preserve">  +65 </w:t>
+              <w:t xml:space="preserve">  +</w:t>
+            </w:r>
+            <w:proofErr w:type="gramEnd"/>
+            <w:r>
+              <w:rPr>
+                <w:rFonts w:asciiTheme="majorHAnsi" w:hAnsiTheme="majorHAnsi" w:cstheme="majorHAnsi"/>
+                <w:color w:val="1F3864"/>
+                <w:sz w:val="18"/>
+                <w:szCs w:val="18"/>
+              </w:rPr>
+              <w:t xml:space="preserve">65 </w:t>
             </w:r>
             <w:r>
               <w:rPr>
@@ -1500,7 +1951,7 @@
                 <w:sz w:val="18"/>
                 <w:szCs w:val="18"/>
               </w:rPr>
-              <w:t xml:space="preserve">  Singapore</w:t>
+              <w:t xml:space="preserve"> Singapore</w:t>
             </w:r>
           </w:p>
           <w:p>
@@ -1526,7 +1977,7 @@
                 <w:sz w:val="18"/>
                 <w:szCs w:val="18"/>
               </w:rPr>
-              <w:t xml:space="preserve">  </w:t>
+              <w:t xml:space="preserve"> </w:t>
             </w:r>
             <w:r>
               <w:rPr>
@@ -1830,6 +2281,7 @@
                 <w:rFonts w:asciiTheme="majorHAnsi" w:hAnsiTheme="majorHAnsi" w:cstheme="majorHAnsi"/>
               </w:rPr>
             </w:pPr>
+            <w:proofErr w:type="gramStart"/>
             <w:r>
               <w:rPr>
                 <w:rFonts w:ascii="Segoe UI Emoji" w:hAnsi="Segoe UI Emoji" w:cs="Segoe UI Emoji"/>
@@ -1846,7 +2298,17 @@
                 <w:sz w:val="18"/>
                 <w:szCs w:val="18"/>
               </w:rPr>
-              <w:t xml:space="preserve">  Markets &amp; Fintech</w:t>
+              <w:t xml:space="preserve">  Markets</w:t>
+            </w:r>
+            <w:proofErr w:type="gramEnd"/>
+            <w:r>
+              <w:rPr>
+                <w:rFonts w:asciiTheme="majorHAnsi" w:hAnsiTheme="majorHAnsi" w:cstheme="majorHAnsi"/>
+                <w:color w:val="1F3864"/>
+                <w:sz w:val="18"/>
+                <w:szCs w:val="18"/>
+              </w:rPr>
+              <w:t xml:space="preserve"> &amp; Fintech</w:t>
             </w:r>
           </w:p>
           <w:p>
@@ -1856,6 +2318,7 @@
                 <w:rFonts w:asciiTheme="majorHAnsi" w:hAnsiTheme="majorHAnsi" w:cstheme="majorHAnsi"/>
               </w:rPr>
             </w:pPr>
+            <w:proofErr w:type="gramStart"/>
             <w:r>
               <w:rPr>
                 <w:rFonts w:ascii="Segoe UI Emoji" w:hAnsi="Segoe UI Emoji" w:cs="Segoe UI Emoji"/>
@@ -1872,7 +2335,17 @@
                 <w:sz w:val="18"/>
                 <w:szCs w:val="18"/>
               </w:rPr>
-              <w:t xml:space="preserve">  AI/ML Research</w:t>
+              <w:t xml:space="preserve">  AI</w:t>
+            </w:r>
+            <w:proofErr w:type="gramEnd"/>
+            <w:r>
+              <w:rPr>
+                <w:rFonts w:asciiTheme="majorHAnsi" w:hAnsiTheme="majorHAnsi" w:cstheme="majorHAnsi"/>
+                <w:color w:val="1F3864"/>
+                <w:sz w:val="18"/>
+                <w:szCs w:val="18"/>
+              </w:rPr>
+              <w:t>/ML Research</w:t>
             </w:r>
           </w:p>
           <w:p>
@@ -1882,6 +2355,7 @@
                 <w:rFonts w:asciiTheme="majorHAnsi" w:hAnsiTheme="majorHAnsi" w:cstheme="majorHAnsi"/>
               </w:rPr>
             </w:pPr>
+            <w:proofErr w:type="gramStart"/>
             <w:r>
               <w:rPr>
                 <w:rFonts w:ascii="Segoe UI Emoji" w:hAnsi="Segoe UI Emoji" w:cs="Segoe UI Emoji"/>
@@ -1898,7 +2372,17 @@
                 <w:sz w:val="18"/>
                 <w:szCs w:val="18"/>
               </w:rPr>
-              <w:t xml:space="preserve">  Reading Tech Blogs</w:t>
+              <w:t xml:space="preserve">  Reading</w:t>
+            </w:r>
+            <w:proofErr w:type="gramEnd"/>
+            <w:r>
+              <w:rPr>
+                <w:rFonts w:asciiTheme="majorHAnsi" w:hAnsiTheme="majorHAnsi" w:cstheme="majorHAnsi"/>
+                <w:color w:val="1F3864"/>
+                <w:sz w:val="18"/>
+                <w:szCs w:val="18"/>
+              </w:rPr>
+              <w:t xml:space="preserve"> Tech Blogs</w:t>
             </w:r>
           </w:p>
           <w:p>
@@ -2497,6 +2981,44 @@
     </w:sectPr>
   </w:body>
 </w:document>
+</file>
+
+<file path=word/endnotes.xml><?xml version="1.0" encoding="utf-8"?>
+<w:endnotes xmlns:wpc="http://schemas.microsoft.com/office/word/2010/wordprocessingCanvas" xmlns:cx="http://schemas.microsoft.com/office/drawing/2014/chartex" xmlns:cx1="http://schemas.microsoft.com/office/drawing/2015/9/8/chartex" xmlns:cx2="http://schemas.microsoft.com/office/drawing/2015/10/21/chartex" xmlns:cx3="http://schemas.microsoft.com/office/drawing/2016/5/9/chartex" xmlns:cx4="http://schemas.microsoft.com/office/drawing/2016/5/10/chartex" xmlns:cx5="http://schemas.microsoft.com/office/drawing/2016/5/11/chartex" xmlns:cx6="http://schemas.microsoft.com/office/drawing/2016/5/12/chartex" xmlns:cx7="http://schemas.microsoft.com/office/drawing/2016/5/13/chartex" xmlns:cx8="http://schemas.microsoft.com/office/drawing/2016/5/14/chartex" xmlns:mc="http://schemas.openxmlformats.org/markup-compatibility/2006" xmlns:aink="http://schemas.microsoft.com/office/drawing/2016/ink" xmlns:am3d="http://schemas.microsoft.com/office/drawing/2017/model3d" xmlns:o="urn:schemas-microsoft-com:office:office" xmlns:oel="http://schemas.microsoft.com/office/2019/extlst" xmlns:r="http://schemas.openxmlformats.org/officeDocument/2006/relationships" xmlns:m="http://schemas.openxmlformats.org/officeDocument/2006/math" xmlns:v="urn:schemas-microsoft-com:vml" xmlns:wp14="http://schemas.microsoft.com/office/word/2010/wordprocessingDrawing" xmlns:wp="http://schemas.openxmlformats.org/drawingml/2006/wordprocessingDrawing" xmlns:w10="urn:schemas-microsoft-com:office:word" xmlns:w="http://schemas.openxmlformats.org/wordprocessingml/2006/main" xmlns:w14="http://schemas.microsoft.com/office/word/2010/wordml" xmlns:w15="http://schemas.microsoft.com/office/word/2012/wordml" xmlns:w16cex="http://schemas.microsoft.com/office/word/2018/wordml/cex" xmlns:w16cid="http://schemas.microsoft.com/office/word/2016/wordml/cid" xmlns:w16="http://schemas.microsoft.com/office/word/2018/wordml" xmlns:w16du="http://schemas.microsoft.com/office/word/2023/wordml/word16du" xmlns:w16sdtdh="http://schemas.microsoft.com/office/word/2020/wordml/sdtdatahash" xmlns:w16sdtfl="http://schemas.microsoft.com/office/word/2024/wordml/sdtformatlock" xmlns:w16se="http://schemas.microsoft.com/office/word/2015/wordml/symex" xmlns:wpg="http://schemas.microsoft.com/office/word/2010/wordprocessingGroup" xmlns:wpi="http://schemas.microsoft.com/office/word/2010/wordprocessingInk" xmlns:wne="http://schemas.microsoft.com/office/word/2006/wordml" xmlns:wps="http://schemas.microsoft.com/office/word/2010/wordprocessingShape" mc:Ignorable="w14 w15 w16se w16cid w16 w16cex w16sdtdh w16sdtfl w16du wp14">
+  <w:endnote w:type="separator" w:id="-1">
+    <w:p>
+      <w:r>
+        <w:separator/>
+      </w:r>
+    </w:p>
+  </w:endnote>
+  <w:endnote w:type="continuationSeparator" w:id="0">
+    <w:p>
+      <w:r>
+        <w:continuationSeparator/>
+      </w:r>
+    </w:p>
+  </w:endnote>
+</w:endnotes>
+</file>
+
+<file path=word/footnotes.xml><?xml version="1.0" encoding="utf-8"?>
+<w:footnotes xmlns:wpc="http://schemas.microsoft.com/office/word/2010/wordprocessingCanvas" xmlns:cx="http://schemas.microsoft.com/office/drawing/2014/chartex" xmlns:cx1="http://schemas.microsoft.com/office/drawing/2015/9/8/chartex" xmlns:cx2="http://schemas.microsoft.com/office/drawing/2015/10/21/chartex" xmlns:cx3="http://schemas.microsoft.com/office/drawing/2016/5/9/chartex" xmlns:cx4="http://schemas.microsoft.com/office/drawing/2016/5/10/chartex" xmlns:cx5="http://schemas.microsoft.com/office/drawing/2016/5/11/chartex" xmlns:cx6="http://schemas.microsoft.com/office/drawing/2016/5/12/chartex" xmlns:cx7="http://schemas.microsoft.com/office/drawing/2016/5/13/chartex" xmlns:cx8="http://schemas.microsoft.com/office/drawing/2016/5/14/chartex" xmlns:mc="http://schemas.openxmlformats.org/markup-compatibility/2006" xmlns:aink="http://schemas.microsoft.com/office/drawing/2016/ink" xmlns:am3d="http://schemas.microsoft.com/office/drawing/2017/model3d" xmlns:o="urn:schemas-microsoft-com:office:office" xmlns:oel="http://schemas.microsoft.com/office/2019/extlst" xmlns:r="http://schemas.openxmlformats.org/officeDocument/2006/relationships" xmlns:m="http://schemas.openxmlformats.org/officeDocument/2006/math" xmlns:v="urn:schemas-microsoft-com:vml" xmlns:wp14="http://schemas.microsoft.com/office/word/2010/wordprocessingDrawing" xmlns:wp="http://schemas.openxmlformats.org/drawingml/2006/wordprocessingDrawing" xmlns:w10="urn:schemas-microsoft-com:office:word" xmlns:w="http://schemas.openxmlformats.org/wordprocessingml/2006/main" xmlns:w14="http://schemas.microsoft.com/office/word/2010/wordml" xmlns:w15="http://schemas.microsoft.com/office/word/2012/wordml" xmlns:w16cex="http://schemas.microsoft.com/office/word/2018/wordml/cex" xmlns:w16cid="http://schemas.microsoft.com/office/word/2016/wordml/cid" xmlns:w16="http://schemas.microsoft.com/office/word/2018/wordml" xmlns:w16du="http://schemas.microsoft.com/office/word/2023/wordml/word16du" xmlns:w16sdtdh="http://schemas.microsoft.com/office/word/2020/wordml/sdtdatahash" xmlns:w16sdtfl="http://schemas.microsoft.com/office/word/2024/wordml/sdtformatlock" xmlns:w16se="http://schemas.microsoft.com/office/word/2015/wordml/symex" xmlns:wpg="http://schemas.microsoft.com/office/word/2010/wordprocessingGroup" xmlns:wpi="http://schemas.microsoft.com/office/word/2010/wordprocessingInk" xmlns:wne="http://schemas.microsoft.com/office/word/2006/wordml" xmlns:wps="http://schemas.microsoft.com/office/word/2010/wordprocessingShape" mc:Ignorable="w14 w15 w16se w16cid w16 w16cex w16sdtdh w16sdtfl w16du wp14">
+  <w:footnote w:type="separator" w:id="-1">
+    <w:p>
+      <w:r>
+        <w:separator/>
+      </w:r>
+    </w:p>
+  </w:footnote>
+  <w:footnote w:type="continuationSeparator" w:id="0">
+    <w:p>
+      <w:r>
+        <w:continuationSeparator/>
+      </w:r>
+    </w:p>
+  </w:footnote>
+</w:footnotes>
 </file>
 
 <file path=word/numbering.xml><?xml version="1.0" encoding="utf-8"?>
@@ -3244,6 +3766,72 @@
       <w:szCs w:val="20"/>
     </w:rPr>
   </w:style>
+  <w:style w:type="character" w:styleId="UnresolvedMention">
+    <w:name w:val="Unresolved Mention"/>
+    <w:basedOn w:val="DefaultParagraphFont"/>
+    <w:uiPriority w:val="99"/>
+    <w:semiHidden/>
+    <w:unhideWhenUsed/>
+    <w:rsid w:val="00F3681C"/>
+    <w:rPr>
+      <w:color w:val="605E5C"/>
+      <w:shd w:val="clear" w:color="auto" w:fill="E1DFDD"/>
+    </w:rPr>
+  </w:style>
+  <w:style w:type="character" w:styleId="FollowedHyperlink">
+    <w:name w:val="FollowedHyperlink"/>
+    <w:basedOn w:val="DefaultParagraphFont"/>
+    <w:uiPriority w:val="99"/>
+    <w:semiHidden/>
+    <w:unhideWhenUsed/>
+    <w:rsid w:val="00C46379"/>
+    <w:rPr>
+      <w:color w:val="954F72" w:themeColor="followedHyperlink"/>
+      <w:u w:val="single"/>
+    </w:rPr>
+  </w:style>
+  <w:style w:type="paragraph" w:styleId="Header">
+    <w:name w:val="header"/>
+    <w:basedOn w:val="Normal"/>
+    <w:link w:val="HeaderChar"/>
+    <w:uiPriority w:val="99"/>
+    <w:unhideWhenUsed/>
+    <w:rsid w:val="00EA46F0"/>
+    <w:pPr>
+      <w:tabs>
+        <w:tab w:val="center" w:pos="4513"/>
+        <w:tab w:val="right" w:pos="9026"/>
+      </w:tabs>
+    </w:pPr>
+  </w:style>
+  <w:style w:type="character" w:customStyle="1" w:styleId="HeaderChar">
+    <w:name w:val="Header Char"/>
+    <w:basedOn w:val="DefaultParagraphFont"/>
+    <w:link w:val="Header"/>
+    <w:uiPriority w:val="99"/>
+    <w:rsid w:val="00EA46F0"/>
+  </w:style>
+  <w:style w:type="paragraph" w:styleId="Footer">
+    <w:name w:val="footer"/>
+    <w:basedOn w:val="Normal"/>
+    <w:link w:val="FooterChar"/>
+    <w:uiPriority w:val="99"/>
+    <w:unhideWhenUsed/>
+    <w:rsid w:val="00EA46F0"/>
+    <w:pPr>
+      <w:tabs>
+        <w:tab w:val="center" w:pos="4513"/>
+        <w:tab w:val="right" w:pos="9026"/>
+      </w:tabs>
+    </w:pPr>
+  </w:style>
+  <w:style w:type="character" w:customStyle="1" w:styleId="FooterChar">
+    <w:name w:val="Footer Char"/>
+    <w:basedOn w:val="DefaultParagraphFont"/>
+    <w:link w:val="Footer"/>
+    <w:uiPriority w:val="99"/>
+    <w:rsid w:val="00EA46F0"/>
+  </w:style>
 </w:styles>
 </file>
 

</xml_diff>